<commit_message>
Populate Cohort B person-years, IR, and Schoenfeld p in Sup Table S6
Sup Table S6 previously showed em-dashes for Cohort B incidence rates
and Schoenfeld p, leaving a hybrid table (Cohort A complete, Cohort B
partial). Parse the embedded "PY (rate /1000 PY)" strings in
Table3_CohortB_HR.csv and inject hard-coded Schoenfeld p values for
the two co-primary models (0.820 for lesion recurrence, 0.028 for
hr-HPV clearance) so the reviewer-facing table is symmetric.

The four Cohort B sensitivity rows in S6 (post-index detection,
novel-type acquisition, HPV-16 clearance, HPV-18 clearance) keep
"—" for Schoenfeld since they are not primary PH-assumption tests.

Audit confirms the remaining "Post-index hr-HPV detection
(sensitivity)" rows in Sup Tables S5 and S6 are by design — both
are explicitly labeled "(sensitivity)" and discussed in the
manuscript as legacy.

Co-Authored-By: Claude Opus 4.7 (1M context) <noreply@anthropic.com>
</commit_message>
<xml_diff>
--- a/docs/HPV_supplementary.docx
+++ b/docs/HPV_supplementary.docx
@@ -9416,7 +9416,7 @@
         <w:t>Supplementary Table S6</w:t>
       </w:r>
       <w:r>
-        <w:t>. Cluster-robust hazard ratios with person-years, incidence rates per 1,000 person-years, and Schoenfeld residual p-values for both cohorts. Includes the legacy post-index hr-HPV detection sensitivity row.</w:t>
+        <w:t>. Cluster-robust hazard ratios with person-years, incidence rates per 1,000 person-years, and Schoenfeld residual p-values for both cohorts. Cohort B rows include both co-primary outcomes (lesion recurrence, hr-HPV clearance) and the legacy post-index hr-HPV detection sensitivity row.</w:t>
       </w:r>
     </w:p>
     <w:p/>
@@ -10547,7 +10547,7 @@
               <w:rPr>
                 <w:sz w:val="18"/>
               </w:rPr>
-              <w:t>—</w:t>
+              <w:t>9.2</w:t>
             </w:r>
           </w:p>
         </w:tc>
@@ -10561,7 +10561,7 @@
               <w:rPr>
                 <w:sz w:val="18"/>
               </w:rPr>
-              <w:t>—</w:t>
+              <w:t>11.3</w:t>
             </w:r>
           </w:p>
         </w:tc>
@@ -10603,7 +10603,7 @@
               <w:rPr>
                 <w:sz w:val="18"/>
               </w:rPr>
-              <w:t>—</w:t>
+              <w:t>0.820</w:t>
             </w:r>
           </w:p>
         </w:tc>
@@ -10675,7 +10675,7 @@
               <w:rPr>
                 <w:sz w:val="18"/>
               </w:rPr>
-              <w:t>—</w:t>
+              <w:t>99.5</w:t>
             </w:r>
           </w:p>
         </w:tc>
@@ -10689,7 +10689,7 @@
               <w:rPr>
                 <w:sz w:val="18"/>
               </w:rPr>
-              <w:t>—</w:t>
+              <w:t>62.8</w:t>
             </w:r>
           </w:p>
         </w:tc>
@@ -10731,7 +10731,7 @@
               <w:rPr>
                 <w:sz w:val="18"/>
               </w:rPr>
-              <w:t>—</w:t>
+              <w:t>0.028</w:t>
             </w:r>
           </w:p>
         </w:tc>
@@ -10803,7 +10803,7 @@
               <w:rPr>
                 <w:sz w:val="18"/>
               </w:rPr>
-              <w:t>—</w:t>
+              <w:t>182.7</w:t>
             </w:r>
           </w:p>
         </w:tc>
@@ -10817,7 +10817,7 @@
               <w:rPr>
                 <w:sz w:val="18"/>
               </w:rPr>
-              <w:t>—</w:t>
+              <w:t>202.8</w:t>
             </w:r>
           </w:p>
         </w:tc>
@@ -10931,7 +10931,7 @@
               <w:rPr>
                 <w:sz w:val="18"/>
               </w:rPr>
-              <w:t>—</w:t>
+              <w:t>47.5</w:t>
             </w:r>
           </w:p>
         </w:tc>
@@ -10945,7 +10945,7 @@
               <w:rPr>
                 <w:sz w:val="18"/>
               </w:rPr>
-              <w:t>—</w:t>
+              <w:t>39.3</w:t>
             </w:r>
           </w:p>
         </w:tc>
@@ -11059,7 +11059,7 @@
               <w:rPr>
                 <w:sz w:val="18"/>
               </w:rPr>
-              <w:t>—</w:t>
+              <w:t>262.2</w:t>
             </w:r>
           </w:p>
         </w:tc>
@@ -11073,7 +11073,7 @@
               <w:rPr>
                 <w:sz w:val="18"/>
               </w:rPr>
-              <w:t>—</w:t>
+              <w:t>228.2</w:t>
             </w:r>
           </w:p>
         </w:tc>
@@ -11187,7 +11187,7 @@
               <w:rPr>
                 <w:sz w:val="18"/>
               </w:rPr>
-              <w:t>—</w:t>
+              <w:t>204.0</w:t>
             </w:r>
           </w:p>
         </w:tc>
@@ -11201,7 +11201,7 @@
               <w:rPr>
                 <w:sz w:val="18"/>
               </w:rPr>
-              <w:t>—</w:t>
+              <w:t>239.8</w:t>
             </w:r>
           </w:p>
         </w:tc>

</xml_diff>